<commit_message>
Cập nhật hệ thống AI, sử dụng Leader làm trọng tâm của team
</commit_message>
<xml_diff>
--- a/Document/Card.docx
+++ b/Document/Card.docx
@@ -91,7 +91,17 @@
         <w:t xml:space="preserve">Mặc dù những lá bài giá cao có một nhược điểm to đùng đùng: ta không thể spawn nó đầu và giữa trận. </w:t>
       </w:r>
       <w:r>
-        <w:t>Nhưng chúng tối ưu chi phí hơn những lá bài giá thấp, giống như việc Repeater trong PvZ , hỏa lực bằng nhau nhưng tối ưu diện tích hơn là 2 cây Peashooter. Hoặc chúng mạnh trong một số trường hợp cụ thể</w:t>
+        <w:t xml:space="preserve">Nhưng chúng </w:t>
+      </w:r>
+      <w:r>
+        <w:rPr>
+          <w:b/>
+          <w:bCs/>
+        </w:rPr>
+        <w:t>tối ưu chi phí</w:t>
+      </w:r>
+      <w:r>
+        <w:t xml:space="preserve"> hơn những lá bài giá thấp, giống như việc Repeater trong PvZ , hỏa lực bằng nhau nhưng tối ưu diện tích hơn là 2 cây Peashooter. Hoặc chúng mạnh trong một số trường hợp cụ thể</w:t>
       </w:r>
     </w:p>
     <w:p>
@@ -243,10 +253,7 @@
     </w:p>
     <w:p>
       <w:r>
-        <w:t xml:space="preserve">Dự kiến khi người chơi hoàn thành hết campain và mini-game sẽ nhận đủ Monkey và Alien để phủ một lượng lớn </w:t>
-      </w:r>
-      <w:r>
-        <w:t>thẻ Common, Uncommon, Rare</w:t>
+        <w:t>Dự kiến khi người chơi hoàn thành hết campain và mini-game sẽ nhận đủ Monkey và Alien để phủ một lượng lớn thẻ Common, Uncommon, Rare</w:t>
       </w:r>
       <w:r>
         <w:t xml:space="preserve">. Những thẻ Common đã được nâng cấp lên mức tối đa, </w:t>

</xml_diff>